<commit_message>
Adiciona seção de divisão de tarefas e guia COMO_RODAR
- Relatório: nova seção "6. Divisão de Tarefas" (Daniel, Cesario, Samuel)
  por eixo técnico do pipeline; regenera .docx e .pdf
- COMO_RODAR.md: passo a passo de instalação e execução para avaliação
</commit_message>
<xml_diff>
--- a/entregaveis/Relatorio_DecidAI.docx
+++ b/entregaveis/Relatorio_DecidAI.docx
@@ -4355,6 +4355,466 @@
       </w:pPr>
       <w:r>
         <w:t xml:space="preserve">Integrar o SAD ao ERP da empresa para execução automática semanal.</w:t>
+      </w:r>
+    </w:p>
+    <w:p>
+      <w:pPr>
+        <w:pStyle w:val="Heading1"/>
+      </w:pPr>
+      <w:r>
+        <w:t xml:space="preserve">6. Divisão de Tarefas</w:t>
+      </w:r>
+    </w:p>
+    <w:p>
+      <w:pPr>
+        <w:spacing w:after="120" w:line="276"/>
+        <w:jc w:val="both"/>
+      </w:pPr>
+      <w:r>
+        <w:t xml:space="preserve">O desenvolvimento foi organizado por camadas da arquitetura: cada integrante respondeu por um eixo técnico do pipeline, com integração contínua entre as partes.</w:t>
+      </w:r>
+    </w:p>
+    <w:tbl>
+      <w:tblPr>
+        <w:tblW w:type="dxa" w:w="9026"/>
+        <w:tblBorders>
+          <w:top w:val="single" w:color="auto" w:sz="4"/>
+          <w:left w:val="single" w:color="auto" w:sz="4"/>
+          <w:bottom w:val="single" w:color="auto" w:sz="4"/>
+          <w:right w:val="single" w:color="auto" w:sz="4"/>
+          <w:insideH w:val="single" w:color="auto" w:sz="4"/>
+          <w:insideV w:val="single" w:color="auto" w:sz="4"/>
+        </w:tblBorders>
+      </w:tblPr>
+      <w:tblGrid>
+        <w:gridCol w:w="2200"/>
+        <w:gridCol w:w="4400"/>
+        <w:gridCol w:w="2426"/>
+      </w:tblGrid>
+      <w:tr>
+        <w:trPr>
+          <w:tblHeader/>
+        </w:trPr>
+        <w:tc>
+          <w:tcPr>
+            <w:tcW w:type="dxa" w:w="2200"/>
+            <w:tcBorders>
+              <w:top w:val="single" w:color="BBBBBB" w:sz="1"/>
+              <w:left w:val="single" w:color="BBBBBB" w:sz="1"/>
+              <w:bottom w:val="single" w:color="BBBBBB" w:sz="1"/>
+              <w:right w:val="single" w:color="BBBBBB" w:sz="1"/>
+            </w:tcBorders>
+            <w:shd w:fill="1F4E79" w:val="clear"/>
+            <w:tcMar>
+              <w:top w:type="dxa" w:w="60"/>
+              <w:left w:type="dxa" w:w="120"/>
+              <w:bottom w:type="dxa" w:w="60"/>
+              <w:right w:type="dxa" w:w="120"/>
+            </w:tcMar>
+            <w:vAlign w:val="center"/>
+          </w:tcPr>
+          <w:p>
+            <w:pPr>
+              <w:jc w:val="left"/>
+            </w:pPr>
+            <w:r>
+              <w:rPr>
+                <w:b/>
+                <w:bCs/>
+                <w:color w:val="FFFFFF"/>
+              </w:rPr>
+              <w:t xml:space="preserve">Integrante</w:t>
+            </w:r>
+          </w:p>
+        </w:tc>
+        <w:tc>
+          <w:tcPr>
+            <w:tcW w:type="dxa" w:w="4400"/>
+            <w:tcBorders>
+              <w:top w:val="single" w:color="BBBBBB" w:sz="1"/>
+              <w:left w:val="single" w:color="BBBBBB" w:sz="1"/>
+              <w:bottom w:val="single" w:color="BBBBBB" w:sz="1"/>
+              <w:right w:val="single" w:color="BBBBBB" w:sz="1"/>
+            </w:tcBorders>
+            <w:shd w:fill="1F4E79" w:val="clear"/>
+            <w:tcMar>
+              <w:top w:type="dxa" w:w="60"/>
+              <w:left w:type="dxa" w:w="120"/>
+              <w:bottom w:type="dxa" w:w="60"/>
+              <w:right w:type="dxa" w:w="120"/>
+            </w:tcMar>
+            <w:vAlign w:val="center"/>
+          </w:tcPr>
+          <w:p>
+            <w:pPr>
+              <w:jc w:val="left"/>
+            </w:pPr>
+            <w:r>
+              <w:rPr>
+                <w:b/>
+                <w:bCs/>
+                <w:color w:val="FFFFFF"/>
+              </w:rPr>
+              <w:t xml:space="preserve">Responsabilidades principais</w:t>
+            </w:r>
+          </w:p>
+        </w:tc>
+        <w:tc>
+          <w:tcPr>
+            <w:tcW w:type="dxa" w:w="2426"/>
+            <w:tcBorders>
+              <w:top w:val="single" w:color="BBBBBB" w:sz="1"/>
+              <w:left w:val="single" w:color="BBBBBB" w:sz="1"/>
+              <w:bottom w:val="single" w:color="BBBBBB" w:sz="1"/>
+              <w:right w:val="single" w:color="BBBBBB" w:sz="1"/>
+            </w:tcBorders>
+            <w:shd w:fill="1F4E79" w:val="clear"/>
+            <w:tcMar>
+              <w:top w:type="dxa" w:w="60"/>
+              <w:left w:type="dxa" w:w="120"/>
+              <w:bottom w:type="dxa" w:w="60"/>
+              <w:right w:type="dxa" w:w="120"/>
+            </w:tcMar>
+            <w:vAlign w:val="center"/>
+          </w:tcPr>
+          <w:p>
+            <w:pPr>
+              <w:jc w:val="left"/>
+            </w:pPr>
+            <w:r>
+              <w:rPr>
+                <w:b/>
+                <w:bCs/>
+                <w:color w:val="FFFFFF"/>
+              </w:rPr>
+              <w:t xml:space="preserve">Artefatos</w:t>
+            </w:r>
+          </w:p>
+        </w:tc>
+      </w:tr>
+      <w:tr>
+        <w:tc>
+          <w:tcPr>
+            <w:tcW w:type="dxa" w:w="2200"/>
+            <w:tcBorders>
+              <w:top w:val="single" w:color="BBBBBB" w:sz="1"/>
+              <w:left w:val="single" w:color="BBBBBB" w:sz="1"/>
+              <w:bottom w:val="single" w:color="BBBBBB" w:sz="1"/>
+              <w:right w:val="single" w:color="BBBBBB" w:sz="1"/>
+            </w:tcBorders>
+            <w:tcMar>
+              <w:top w:type="dxa" w:w="60"/>
+              <w:left w:type="dxa" w:w="120"/>
+              <w:bottom w:type="dxa" w:w="60"/>
+              <w:right w:type="dxa" w:w="120"/>
+            </w:tcMar>
+            <w:vAlign w:val="center"/>
+          </w:tcPr>
+          <w:p>
+            <w:pPr>
+              <w:jc w:val="left"/>
+            </w:pPr>
+            <w:r>
+              <w:rPr>
+                <w:b w:val="false"/>
+                <w:bCs w:val="false"/>
+                <w:color w:val="000000"/>
+              </w:rPr>
+              <w:t xml:space="preserve">Daniel Dewes</w:t>
+            </w:r>
+          </w:p>
+        </w:tc>
+        <w:tc>
+          <w:tcPr>
+            <w:tcW w:type="dxa" w:w="4400"/>
+            <w:tcBorders>
+              <w:top w:val="single" w:color="BBBBBB" w:sz="1"/>
+              <w:left w:val="single" w:color="BBBBBB" w:sz="1"/>
+              <w:bottom w:val="single" w:color="BBBBBB" w:sz="1"/>
+              <w:right w:val="single" w:color="BBBBBB" w:sz="1"/>
+            </w:tcBorders>
+            <w:tcMar>
+              <w:top w:type="dxa" w:w="60"/>
+              <w:left w:type="dxa" w:w="120"/>
+              <w:bottom w:type="dxa" w:w="60"/>
+              <w:right w:type="dxa" w:w="120"/>
+            </w:tcMar>
+            <w:vAlign w:val="center"/>
+          </w:tcPr>
+          <w:p>
+            <w:pPr>
+              <w:jc w:val="left"/>
+            </w:pPr>
+            <w:r>
+              <w:rPr>
+                <w:b w:val="false"/>
+                <w:bCs w:val="false"/>
+                <w:color w:val="000000"/>
+              </w:rPr>
+              <w:t xml:space="preserve">Camada de dados e previsão (ML); orquestração do pipeline ponta a ponta</w:t>
+            </w:r>
+          </w:p>
+        </w:tc>
+        <w:tc>
+          <w:tcPr>
+            <w:tcW w:type="dxa" w:w="2426"/>
+            <w:tcBorders>
+              <w:top w:val="single" w:color="BBBBBB" w:sz="1"/>
+              <w:left w:val="single" w:color="BBBBBB" w:sz="1"/>
+              <w:bottom w:val="single" w:color="BBBBBB" w:sz="1"/>
+              <w:right w:val="single" w:color="BBBBBB" w:sz="1"/>
+            </w:tcBorders>
+            <w:tcMar>
+              <w:top w:type="dxa" w:w="60"/>
+              <w:left w:type="dxa" w:w="120"/>
+              <w:bottom w:type="dxa" w:w="60"/>
+              <w:right w:type="dxa" w:w="120"/>
+            </w:tcMar>
+            <w:vAlign w:val="center"/>
+          </w:tcPr>
+          <w:p>
+            <w:pPr>
+              <w:jc w:val="left"/>
+            </w:pPr>
+            <w:r>
+              <w:rPr>
+                <w:b w:val="false"/>
+                <w:bCs w:val="false"/>
+                <w:color w:val="000000"/>
+              </w:rPr>
+              <w:t xml:space="preserve">data_gen.py, forecast.py, pipeline.py</w:t>
+            </w:r>
+          </w:p>
+        </w:tc>
+      </w:tr>
+      <w:tr>
+        <w:tc>
+          <w:tcPr>
+            <w:tcW w:type="dxa" w:w="2200"/>
+            <w:tcBorders>
+              <w:top w:val="single" w:color="BBBBBB" w:sz="1"/>
+              <w:left w:val="single" w:color="BBBBBB" w:sz="1"/>
+              <w:bottom w:val="single" w:color="BBBBBB" w:sz="1"/>
+              <w:right w:val="single" w:color="BBBBBB" w:sz="1"/>
+            </w:tcBorders>
+            <w:tcMar>
+              <w:top w:type="dxa" w:w="60"/>
+              <w:left w:type="dxa" w:w="120"/>
+              <w:bottom w:type="dxa" w:w="60"/>
+              <w:right w:type="dxa" w:w="120"/>
+            </w:tcMar>
+            <w:vAlign w:val="center"/>
+          </w:tcPr>
+          <w:p>
+            <w:pPr>
+              <w:jc w:val="left"/>
+            </w:pPr>
+            <w:r>
+              <w:rPr>
+                <w:b w:val="false"/>
+                <w:bCs w:val="false"/>
+                <w:color w:val="000000"/>
+              </w:rPr>
+              <w:t xml:space="preserve">Cesario Stoquero</w:t>
+            </w:r>
+          </w:p>
+        </w:tc>
+        <w:tc>
+          <w:tcPr>
+            <w:tcW w:type="dxa" w:w="4400"/>
+            <w:tcBorders>
+              <w:top w:val="single" w:color="BBBBBB" w:sz="1"/>
+              <w:left w:val="single" w:color="BBBBBB" w:sz="1"/>
+              <w:bottom w:val="single" w:color="BBBBBB" w:sz="1"/>
+              <w:right w:val="single" w:color="BBBBBB" w:sz="1"/>
+            </w:tcBorders>
+            <w:tcMar>
+              <w:top w:type="dxa" w:w="60"/>
+              <w:left w:type="dxa" w:w="120"/>
+              <w:bottom w:type="dxa" w:w="60"/>
+              <w:right w:type="dxa" w:w="120"/>
+            </w:tcMar>
+            <w:vAlign w:val="center"/>
+          </w:tcPr>
+          <w:p>
+            <w:pPr>
+              <w:jc w:val="left"/>
+            </w:pPr>
+            <w:r>
+              <w:rPr>
+                <w:b w:val="false"/>
+                <w:bCs w:val="false"/>
+                <w:color w:val="000000"/>
+              </w:rPr>
+              <w:t xml:space="preserve">Tratamento da incerteza (Monte Carlo + Markov) e otimização (Simplex); análise de sensibilidade</w:t>
+            </w:r>
+          </w:p>
+        </w:tc>
+        <w:tc>
+          <w:tcPr>
+            <w:tcW w:type="dxa" w:w="2426"/>
+            <w:tcBorders>
+              <w:top w:val="single" w:color="BBBBBB" w:sz="1"/>
+              <w:left w:val="single" w:color="BBBBBB" w:sz="1"/>
+              <w:bottom w:val="single" w:color="BBBBBB" w:sz="1"/>
+              <w:right w:val="single" w:color="BBBBBB" w:sz="1"/>
+            </w:tcBorders>
+            <w:tcMar>
+              <w:top w:type="dxa" w:w="60"/>
+              <w:left w:type="dxa" w:w="120"/>
+              <w:bottom w:type="dxa" w:w="60"/>
+              <w:right w:type="dxa" w:w="120"/>
+            </w:tcMar>
+            <w:vAlign w:val="center"/>
+          </w:tcPr>
+          <w:p>
+            <w:pPr>
+              <w:jc w:val="left"/>
+            </w:pPr>
+            <w:r>
+              <w:rPr>
+                <w:b w:val="false"/>
+                <w:bCs w:val="false"/>
+                <w:color w:val="000000"/>
+              </w:rPr>
+              <w:t xml:space="preserve">simulation.py, optimization.py</w:t>
+            </w:r>
+          </w:p>
+        </w:tc>
+      </w:tr>
+      <w:tr>
+        <w:tc>
+          <w:tcPr>
+            <w:tcW w:type="dxa" w:w="2200"/>
+            <w:tcBorders>
+              <w:top w:val="single" w:color="BBBBBB" w:sz="1"/>
+              <w:left w:val="single" w:color="BBBBBB" w:sz="1"/>
+              <w:bottom w:val="single" w:color="BBBBBB" w:sz="1"/>
+              <w:right w:val="single" w:color="BBBBBB" w:sz="1"/>
+            </w:tcBorders>
+            <w:tcMar>
+              <w:top w:type="dxa" w:w="60"/>
+              <w:left w:type="dxa" w:w="120"/>
+              <w:bottom w:type="dxa" w:w="60"/>
+              <w:right w:type="dxa" w:w="120"/>
+            </w:tcMar>
+            <w:vAlign w:val="center"/>
+          </w:tcPr>
+          <w:p>
+            <w:pPr>
+              <w:jc w:val="left"/>
+            </w:pPr>
+            <w:r>
+              <w:rPr>
+                <w:b w:val="false"/>
+                <w:bCs w:val="false"/>
+                <w:color w:val="000000"/>
+              </w:rPr>
+              <w:t xml:space="preserve">Samuel Maciel</w:t>
+            </w:r>
+          </w:p>
+        </w:tc>
+        <w:tc>
+          <w:tcPr>
+            <w:tcW w:type="dxa" w:w="4400"/>
+            <w:tcBorders>
+              <w:top w:val="single" w:color="BBBBBB" w:sz="1"/>
+              <w:left w:val="single" w:color="BBBBBB" w:sz="1"/>
+              <w:bottom w:val="single" w:color="BBBBBB" w:sz="1"/>
+              <w:right w:val="single" w:color="BBBBBB" w:sz="1"/>
+            </w:tcBorders>
+            <w:tcMar>
+              <w:top w:type="dxa" w:w="60"/>
+              <w:left w:type="dxa" w:w="120"/>
+              <w:bottom w:type="dxa" w:w="60"/>
+              <w:right w:type="dxa" w:w="120"/>
+            </w:tcMar>
+            <w:vAlign w:val="center"/>
+          </w:tcPr>
+          <w:p>
+            <w:pPr>
+              <w:jc w:val="left"/>
+            </w:pPr>
+            <w:r>
+              <w:rPr>
+                <w:b w:val="false"/>
+                <w:bCs w:val="false"/>
+                <w:color w:val="000000"/>
+              </w:rPr>
+              <w:t xml:space="preserve">Explicabilidade (XAI) e interface executiva (dashboard Streamlit)</w:t>
+            </w:r>
+          </w:p>
+        </w:tc>
+        <w:tc>
+          <w:tcPr>
+            <w:tcW w:type="dxa" w:w="2426"/>
+            <w:tcBorders>
+              <w:top w:val="single" w:color="BBBBBB" w:sz="1"/>
+              <w:left w:val="single" w:color="BBBBBB" w:sz="1"/>
+              <w:bottom w:val="single" w:color="BBBBBB" w:sz="1"/>
+              <w:right w:val="single" w:color="BBBBBB" w:sz="1"/>
+            </w:tcBorders>
+            <w:tcMar>
+              <w:top w:type="dxa" w:w="60"/>
+              <w:left w:type="dxa" w:w="120"/>
+              <w:bottom w:type="dxa" w:w="60"/>
+              <w:right w:type="dxa" w:w="120"/>
+            </w:tcMar>
+            <w:vAlign w:val="center"/>
+          </w:tcPr>
+          <w:p>
+            <w:pPr>
+              <w:jc w:val="left"/>
+            </w:pPr>
+            <w:r>
+              <w:rPr>
+                <w:b w:val="false"/>
+                <w:bCs w:val="false"/>
+                <w:color w:val="000000"/>
+              </w:rPr>
+              <w:t xml:space="preserve">xai.py, app/dashboard.py</w:t>
+            </w:r>
+          </w:p>
+        </w:tc>
+      </w:tr>
+    </w:tbl>
+    <w:p>
+      <w:pPr>
+        <w:spacing w:after="120" w:line="276"/>
+        <w:jc w:val="both"/>
+      </w:pPr>
+      <w:r>
+        <w:t xml:space="preserve">A </w:t>
+      </w:r>
+      <w:r>
+        <w:rPr>
+          <w:b/>
+          <w:bCs/>
+        </w:rPr>
+        <w:t xml:space="preserve">redação do relatório</w:t>
+      </w:r>
+      <w:r>
+        <w:t xml:space="preserve">, a </w:t>
+      </w:r>
+      <w:r>
+        <w:rPr>
+          <w:b/>
+          <w:bCs/>
+        </w:rPr>
+        <w:t xml:space="preserve">preparação da apresentação</w:t>
+      </w:r>
+      <w:r>
+        <w:t xml:space="preserve"> e a </w:t>
+      </w:r>
+      <w:r>
+        <w:rPr>
+          <w:b/>
+          <w:bCs/>
+        </w:rPr>
+        <w:t xml:space="preserve">revisão dos resultados</w:t>
+      </w:r>
+      <w:r>
+        <w:t xml:space="preserve"> foram conduzidas em conjunto pelos três integrantes.</w:t>
       </w:r>
     </w:p>
     <w:sectPr>

</xml_diff>

<commit_message>
Inclui Guilherme Capeletti nos entregaveis e adiciona roteiro da apresentacao
- Adiciona Guilherme Capeletti a tabela de divisao de tarefas do relatorio
  (config.py, tests/test_smoke.py, entregaveis/) e ajusta "tres" -> "quatro integrantes"
- Regenera os entregaveis (.docx/.pptx/.pdf) a partir dos geradores em JS
- Adiciona Roteiro_Apresentacao.md com a divisao das falas entre os quatro
  integrantes para a entrega executiva (4 blocos / 30 min)
</commit_message>
<xml_diff>
--- a/entregaveis/Relatorio_DecidAI.docx
+++ b/entregaveis/Relatorio_DecidAI.docx
@@ -97,7 +97,7 @@
         <w:jc w:val="center"/>
       </w:pPr>
       <w:r>
-        <w:t xml:space="preserve">Daniel Dewes  •  Cesario Stoquero  •  Samuel Maciel</w:t>
+        <w:t xml:space="preserve">Daniel Dewes  •  Cesario Stoquero  •  Samuel Maciel •  Guilherme Capeletti</w:t>
       </w:r>
     </w:p>
     <w:p>
@@ -4777,6 +4777,101 @@
           </w:p>
         </w:tc>
       </w:tr>
+      <w:tr>
+        <w:tc>
+          <w:tcPr>
+            <w:tcW w:type="dxa" w:w="2200"/>
+            <w:tcBorders>
+              <w:top w:val="single" w:color="BBBBBB" w:sz="1"/>
+              <w:left w:val="single" w:color="BBBBBB" w:sz="1"/>
+              <w:bottom w:val="single" w:color="BBBBBB" w:sz="1"/>
+              <w:right w:val="single" w:color="BBBBBB" w:sz="1"/>
+            </w:tcBorders>
+            <w:tcMar>
+              <w:top w:type="dxa" w:w="60"/>
+              <w:left w:type="dxa" w:w="120"/>
+              <w:bottom w:type="dxa" w:w="60"/>
+              <w:right w:type="dxa" w:w="120"/>
+            </w:tcMar>
+            <w:vAlign w:val="center"/>
+          </w:tcPr>
+          <w:p>
+            <w:pPr>
+              <w:jc w:val="left"/>
+            </w:pPr>
+            <w:r>
+              <w:rPr>
+                <w:b w:val="false"/>
+                <w:bCs w:val="false"/>
+                <w:color w:val="000000"/>
+              </w:rPr>
+              <w:t xml:space="preserve">Guilherme Capeletti</w:t>
+            </w:r>
+          </w:p>
+        </w:tc>
+        <w:tc>
+          <w:tcPr>
+            <w:tcW w:type="dxa" w:w="4400"/>
+            <w:tcBorders>
+              <w:top w:val="single" w:color="BBBBBB" w:sz="1"/>
+              <w:left w:val="single" w:color="BBBBBB" w:sz="1"/>
+              <w:bottom w:val="single" w:color="BBBBBB" w:sz="1"/>
+              <w:right w:val="single" w:color="BBBBBB" w:sz="1"/>
+            </w:tcBorders>
+            <w:tcMar>
+              <w:top w:type="dxa" w:w="60"/>
+              <w:left w:type="dxa" w:w="120"/>
+              <w:bottom w:type="dxa" w:w="60"/>
+              <w:right w:type="dxa" w:w="120"/>
+            </w:tcMar>
+            <w:vAlign w:val="center"/>
+          </w:tcPr>
+          <w:p>
+            <w:pPr>
+              <w:jc w:val="left"/>
+            </w:pPr>
+            <w:r>
+              <w:rPr>
+                <w:b w:val="false"/>
+                <w:bCs w:val="false"/>
+                <w:color w:val="000000"/>
+              </w:rPr>
+              <w:t xml:space="preserve">Modelagem dos parâmetros de negócio, testes de validação do pipeline e produção dos entregáveis (relatório e apresentação)</w:t>
+            </w:r>
+          </w:p>
+        </w:tc>
+        <w:tc>
+          <w:tcPr>
+            <w:tcW w:type="dxa" w:w="2426"/>
+            <w:tcBorders>
+              <w:top w:val="single" w:color="BBBBBB" w:sz="1"/>
+              <w:left w:val="single" w:color="BBBBBB" w:sz="1"/>
+              <w:bottom w:val="single" w:color="BBBBBB" w:sz="1"/>
+              <w:right w:val="single" w:color="BBBBBB" w:sz="1"/>
+            </w:tcBorders>
+            <w:tcMar>
+              <w:top w:type="dxa" w:w="60"/>
+              <w:left w:type="dxa" w:w="120"/>
+              <w:bottom w:type="dxa" w:w="60"/>
+              <w:right w:type="dxa" w:w="120"/>
+            </w:tcMar>
+            <w:vAlign w:val="center"/>
+          </w:tcPr>
+          <w:p>
+            <w:pPr>
+              <w:jc w:val="left"/>
+            </w:pPr>
+            <w:r>
+              <w:rPr>
+                <w:b w:val="false"/>
+                <w:bCs w:val="false"/>
+                <w:color w:val="000000"/>
+              </w:rPr>
+              <w:t xml:space="preserve">config.py, tests/test_smoke.py, entregaveis/</w:t>
+            </w:r>
+          </w:p>
+        </w:tc>
+      </w:tr>
     </w:tbl>
     <w:p>
       <w:pPr>
@@ -4814,7 +4909,7 @@
         <w:t xml:space="preserve">revisão dos resultados</w:t>
       </w:r>
       <w:r>
-        <w:t xml:space="preserve"> foram conduzidas em conjunto pelos três integrantes.</w:t>
+        <w:t xml:space="preserve"> foram conduzidas em conjunto pelos quatro integrantes.</w:t>
       </w:r>
     </w:p>
     <w:sectPr>

</xml_diff>

<commit_message>
Remove o sumario vazio (campo TOC) do relatorio
- Remove o bloco TableOfContents do gen_relatorio.js (o campo ficava em
  branco no arquivo gerado, pois so e preenchido pelo Word ao atualizar)
- Regenera Relatorio_DecidAI.docx e .pdf: a capa passa direto ao corpo,
  sem pagina de sumario vazia
</commit_message>
<xml_diff>
--- a/entregaveis/Relatorio_DecidAI.docx
+++ b/entregaveis/Relatorio_DecidAI.docx
@@ -107,43 +107,6 @@
       </w:pPr>
       <w:r>
         <w:t xml:space="preserve">Santo Ângelo — RS, junho de 2026</w:t>
-      </w:r>
-    </w:p>
-    <w:p>
-      <w:r>
-        <w:br w:type="page"/>
-      </w:r>
-    </w:p>
-    <w:p>
-      <w:pPr>
-        <w:pStyle w:val="Heading1"/>
-      </w:pPr>
-      <w:r>
-        <w:t xml:space="preserve">Sumário</w:t>
-      </w:r>
-    </w:p>
-    <w:sdt>
-      <w:sdtPr>
-        <w:alias w:val="Sumário"/>
-      </w:sdtPr>
-      <w:sdtContent>
-        <w:p>
-          <w:r>
-            <w:fldChar w:fldCharType="begin" w:dirty="true"/>
-            <w:instrText xml:space="preserve">TOC \h \o "1-2"</w:instrText>
-            <w:fldChar w:fldCharType="separate"/>
-          </w:r>
-        </w:p>
-        <w:p>
-          <w:r>
-            <w:fldChar w:fldCharType="end"/>
-          </w:r>
-        </w:p>
-      </w:sdtContent>
-    </w:sdt>
-    <w:p>
-      <w:r>
-        <w:br w:type="page"/>
       </w:r>
     </w:p>
     <w:p>

</xml_diff>